<commit_message>
Updated schedule, created class for : player, camera and obstacle
</commit_message>
<xml_diff>
--- a/Doc/JT-PRE-TPI.docx
+++ b/Doc/JT-PRE-TPI.docx
@@ -264,7 +264,7 @@
             </w:rPr>
             <w:fldChar w:fldCharType="separate"/>
           </w:r>
-          <w:hyperlink w:anchor="_Toc190701362" w:history="1">
+          <w:hyperlink w:anchor="_Toc190759524" w:history="1">
             <w:r>
               <w:rPr>
                 <w:rStyle w:val="Lienhypertexte"/>
@@ -306,7 +306,7 @@
                 <w:noProof/>
                 <w:webHidden/>
               </w:rPr>
-              <w:instrText xml:space="preserve"> PAGEREF _Toc190701362 \h </w:instrText>
+              <w:instrText xml:space="preserve"> PAGEREF _Toc190759524 \h </w:instrText>
             </w:r>
             <w:r>
               <w:rPr>
@@ -350,7 +350,7 @@
               <w:lang w:eastAsia="fr-CH"/>
             </w:rPr>
           </w:pPr>
-          <w:hyperlink w:anchor="_Toc190701363" w:history="1">
+          <w:hyperlink w:anchor="_Toc190759525" w:history="1">
             <w:r>
               <w:rPr>
                 <w:rStyle w:val="Lienhypertexte"/>
@@ -392,7 +392,7 @@
                 <w:noProof/>
                 <w:webHidden/>
               </w:rPr>
-              <w:instrText xml:space="preserve"> PAGEREF _Toc190701363 \h </w:instrText>
+              <w:instrText xml:space="preserve"> PAGEREF _Toc190759525 \h </w:instrText>
             </w:r>
             <w:r>
               <w:rPr>
@@ -436,7 +436,7 @@
               <w:lang w:eastAsia="fr-CH"/>
             </w:rPr>
           </w:pPr>
-          <w:hyperlink w:anchor="_Toc190701364" w:history="1">
+          <w:hyperlink w:anchor="_Toc190759526" w:history="1">
             <w:r>
               <w:rPr>
                 <w:rStyle w:val="Lienhypertexte"/>
@@ -478,7 +478,7 @@
                 <w:noProof/>
                 <w:webHidden/>
               </w:rPr>
-              <w:instrText xml:space="preserve"> PAGEREF _Toc190701364 \h </w:instrText>
+              <w:instrText xml:space="preserve"> PAGEREF _Toc190759526 \h </w:instrText>
             </w:r>
             <w:r>
               <w:rPr>
@@ -522,7 +522,7 @@
               <w:lang w:eastAsia="fr-CH"/>
             </w:rPr>
           </w:pPr>
-          <w:hyperlink w:anchor="_Toc190701365" w:history="1">
+          <w:hyperlink w:anchor="_Toc190759527" w:history="1">
             <w:r>
               <w:rPr>
                 <w:rStyle w:val="Lienhypertexte"/>
@@ -564,7 +564,7 @@
                 <w:noProof/>
                 <w:webHidden/>
               </w:rPr>
-              <w:instrText xml:space="preserve"> PAGEREF _Toc190701365 \h </w:instrText>
+              <w:instrText xml:space="preserve"> PAGEREF _Toc190759527 \h </w:instrText>
             </w:r>
             <w:r>
               <w:rPr>
@@ -608,7 +608,7 @@
               <w:lang w:eastAsia="fr-CH"/>
             </w:rPr>
           </w:pPr>
-          <w:hyperlink w:anchor="_Toc190701366" w:history="1">
+          <w:hyperlink w:anchor="_Toc190759528" w:history="1">
             <w:r>
               <w:rPr>
                 <w:rStyle w:val="Lienhypertexte"/>
@@ -650,7 +650,7 @@
                 <w:noProof/>
                 <w:webHidden/>
               </w:rPr>
-              <w:instrText xml:space="preserve"> PAGEREF _Toc190701366 \h </w:instrText>
+              <w:instrText xml:space="preserve"> PAGEREF _Toc190759528 \h </w:instrText>
             </w:r>
             <w:r>
               <w:rPr>
@@ -694,7 +694,7 @@
               <w:lang w:eastAsia="fr-CH"/>
             </w:rPr>
           </w:pPr>
-          <w:hyperlink w:anchor="_Toc190701367" w:history="1">
+          <w:hyperlink w:anchor="_Toc190759529" w:history="1">
             <w:r>
               <w:rPr>
                 <w:rStyle w:val="Lienhypertexte"/>
@@ -736,7 +736,7 @@
                 <w:noProof/>
                 <w:webHidden/>
               </w:rPr>
-              <w:instrText xml:space="preserve"> PAGEREF _Toc190701367 \h </w:instrText>
+              <w:instrText xml:space="preserve"> PAGEREF _Toc190759529 \h </w:instrText>
             </w:r>
             <w:r>
               <w:rPr>
@@ -757,6 +757,92 @@
                 <w:webHidden/>
               </w:rPr>
               <w:t>8</w:t>
+            </w:r>
+            <w:r>
+              <w:rPr>
+                <w:noProof/>
+                <w:webHidden/>
+              </w:rPr>
+              <w:fldChar w:fldCharType="end"/>
+            </w:r>
+          </w:hyperlink>
+        </w:p>
+        <w:p>
+          <w:pPr>
+            <w:pStyle w:val="TM1"/>
+            <w:tabs>
+              <w:tab w:val="left" w:pos="440"/>
+              <w:tab w:val="right" w:leader="dot" w:pos="9062"/>
+            </w:tabs>
+            <w:rPr>
+              <w:rFonts w:eastAsiaTheme="minorEastAsia"/>
+              <w:noProof/>
+              <w:lang w:eastAsia="fr-CH"/>
+            </w:rPr>
+          </w:pPr>
+          <w:hyperlink w:anchor="_Toc190759530" w:history="1">
+            <w:r>
+              <w:rPr>
+                <w:rStyle w:val="Lienhypertexte"/>
+                <w:noProof/>
+              </w:rPr>
+              <w:t>1.</w:t>
+            </w:r>
+            <w:r>
+              <w:rPr>
+                <w:rFonts w:eastAsiaTheme="minorEastAsia"/>
+                <w:noProof/>
+                <w:lang w:eastAsia="fr-CH"/>
+              </w:rPr>
+              <w:tab/>
+            </w:r>
+            <w:r>
+              <w:rPr>
+                <w:rStyle w:val="Lienhypertexte"/>
+                <w:noProof/>
+              </w:rPr>
+              <w:t>17.02.2025</w:t>
+            </w:r>
+            <w:r>
+              <w:rPr>
+                <w:noProof/>
+                <w:webHidden/>
+              </w:rPr>
+              <w:tab/>
+            </w:r>
+            <w:r>
+              <w:rPr>
+                <w:noProof/>
+                <w:webHidden/>
+              </w:rPr>
+              <w:fldChar w:fldCharType="begin"/>
+            </w:r>
+            <w:r>
+              <w:rPr>
+                <w:noProof/>
+                <w:webHidden/>
+              </w:rPr>
+              <w:instrText xml:space="preserve"> PAGEREF _Toc190759530 \h </w:instrText>
+            </w:r>
+            <w:r>
+              <w:rPr>
+                <w:noProof/>
+                <w:webHidden/>
+              </w:rPr>
+            </w:r>
+            <w:r>
+              <w:rPr>
+                <w:noProof/>
+                <w:webHidden/>
+              </w:rPr>
+              <w:fldChar w:fldCharType="separate"/>
+            </w:r>
+            <w:r>
+              <w:rPr>
+                <w:noProof/>
+                <w:webHidden/>
+              </w:rPr>
+              <w:t>9</w:t>
             </w:r>
             <w:r>
               <w:rPr>
@@ -792,6 +878,8 @@
             <w:fldChar w:fldCharType="end"/>
           </w:r>
         </w:p>
+        <w:bookmarkStart w:id="0" w:name="_GoBack" w:displacedByCustomXml="next"/>
+        <w:bookmarkEnd w:id="0" w:displacedByCustomXml="next"/>
       </w:sdtContent>
     </w:sdt>
     <w:p>
@@ -802,12 +890,12 @@
           <w:numId w:val="1"/>
         </w:numPr>
       </w:pPr>
-      <w:bookmarkStart w:id="0" w:name="_Toc190701362"/>
+      <w:bookmarkStart w:id="1" w:name="_Toc190759524"/>
       <w:r>
         <w:lastRenderedPageBreak/>
         <w:t>27.01.2025</w:t>
       </w:r>
-      <w:bookmarkEnd w:id="0"/>
+      <w:bookmarkEnd w:id="1"/>
     </w:p>
     <w:p>
       <w:r>
@@ -1017,11 +1105,11 @@
           <w:numId w:val="1"/>
         </w:numPr>
       </w:pPr>
-      <w:bookmarkStart w:id="1" w:name="_Toc190701363"/>
+      <w:bookmarkStart w:id="2" w:name="_Toc190759525"/>
       <w:r>
         <w:t>28.01.2025</w:t>
       </w:r>
-      <w:bookmarkEnd w:id="1"/>
+      <w:bookmarkEnd w:id="2"/>
     </w:p>
     <w:p>
       <w:r>
@@ -1218,12 +1306,12 @@
           <w:numId w:val="1"/>
         </w:numPr>
       </w:pPr>
-      <w:bookmarkStart w:id="2" w:name="_Toc190701364"/>
+      <w:bookmarkStart w:id="3" w:name="_Toc190759526"/>
       <w:r>
         <w:lastRenderedPageBreak/>
         <w:t>03.02.2025</w:t>
       </w:r>
-      <w:bookmarkEnd w:id="2"/>
+      <w:bookmarkEnd w:id="3"/>
     </w:p>
     <w:p>
       <w:r>
@@ -1364,12 +1452,12 @@
           <w:numId w:val="1"/>
         </w:numPr>
       </w:pPr>
-      <w:bookmarkStart w:id="3" w:name="_Toc190701365"/>
+      <w:bookmarkStart w:id="4" w:name="_Toc190759527"/>
       <w:r>
         <w:lastRenderedPageBreak/>
         <w:t>04.02.2025</w:t>
       </w:r>
-      <w:bookmarkEnd w:id="3"/>
+      <w:bookmarkEnd w:id="4"/>
     </w:p>
     <w:p>
       <w:r>
@@ -1558,12 +1646,12 @@
           <w:numId w:val="1"/>
         </w:numPr>
       </w:pPr>
-      <w:bookmarkStart w:id="4" w:name="_Toc190701366"/>
+      <w:bookmarkStart w:id="5" w:name="_Toc190759528"/>
       <w:r>
         <w:lastRenderedPageBreak/>
         <w:t>10.02.2025</w:t>
       </w:r>
-      <w:bookmarkEnd w:id="4"/>
+      <w:bookmarkEnd w:id="5"/>
     </w:p>
     <w:p>
       <w:r>
@@ -1659,15 +1747,15 @@
           <w:numId w:val="1"/>
         </w:numPr>
       </w:pPr>
-      <w:bookmarkStart w:id="5" w:name="_Toc190701367"/>
+      <w:bookmarkStart w:id="6" w:name="_Toc190759529"/>
       <w:r>
         <w:lastRenderedPageBreak/>
         <w:t>11.02.2025</w:t>
       </w:r>
-      <w:bookmarkEnd w:id="5"/>
-    </w:p>
-    <w:p>
-      <w:bookmarkStart w:id="6" w:name="_Hlk190701417"/>
+      <w:bookmarkEnd w:id="6"/>
+    </w:p>
+    <w:p>
+      <w:bookmarkStart w:id="7" w:name="_Hlk190701417"/>
       <w:r>
         <w:rPr>
           <w:b/>
@@ -1683,7 +1771,7 @@
         <w:t xml:space="preserve"> périodes :</w:t>
       </w:r>
     </w:p>
-    <w:bookmarkEnd w:id="6"/>
+    <w:bookmarkEnd w:id="7"/>
     <w:p>
       <w:r>
         <w:t>J'ai changé mon utilisation des BoundingBox pour que, le joueur puisse glisser contre les parois qu'il rencontre et qu'il se déplace immédiatement aux bords de celles-ci s’il est à l'intérieur de l'obstacle. J'ai utilisé les variables et calculs suivants :</w:t>
@@ -1825,16 +1913,12 @@
           <w:numId w:val="11"/>
         </w:numPr>
       </w:pPr>
+      <w:bookmarkStart w:id="8" w:name="_Toc190759530"/>
       <w:r>
         <w:lastRenderedPageBreak/>
-        <w:t>1</w:t>
-      </w:r>
-      <w:r>
-        <w:t>7</w:t>
-      </w:r>
-      <w:r>
-        <w:t>.02.2025</w:t>
-      </w:r>
+        <w:t>17.02.2025</w:t>
+      </w:r>
+      <w:bookmarkEnd w:id="8"/>
     </w:p>
     <w:p>
       <w:r>
@@ -1975,8 +2059,6 @@
       <w:r>
         <w:t>Lorsque le joueur se trouvait contre un obstacle et qu’il pressait la touche de déplacement pour aller contre celle-ci, une petite partie du modèle du joueur se trouvait à l’intérieur de l’obstacle. Ce qui était esthétiquement désagréable bien que le joueur n’allait pas complétement à l’intérieur de l’obstacle. J’ai ajusté ceci en changeant la position du joueur lorsqu’on maintient une touche de déplacement et non sa vitesse.</w:t>
       </w:r>
-      <w:bookmarkStart w:id="7" w:name="_GoBack"/>
-      <w:bookmarkEnd w:id="7"/>
     </w:p>
     <w:p/>
     <w:sectPr>
@@ -4230,7 +4312,7 @@
 </file>
 
 <file path=customXml/itemProps1.xml><?xml version="1.0" encoding="utf-8"?>
-<ds:datastoreItem xmlns:ds="http://schemas.openxmlformats.org/officeDocument/2006/customXml" ds:itemID="{233356B4-37FF-4C17-AB46-16A4A72D1104}">
+<ds:datastoreItem xmlns:ds="http://schemas.openxmlformats.org/officeDocument/2006/customXml" ds:itemID="{A5C7A130-AD4F-4910-940D-EDECF62D60E9}">
   <ds:schemaRefs>
     <ds:schemaRef ds:uri="http://schemas.openxmlformats.org/officeDocument/2006/bibliography"/>
   </ds:schemaRefs>

</xml_diff>

<commit_message>
Updated JT, 4 days missing
</commit_message>
<xml_diff>
--- a/Doc/JT-PRE-TPI.docx
+++ b/Doc/JT-PRE-TPI.docx
@@ -2089,13 +2089,7 @@
       </w:pPr>
       <w:r>
         <w:lastRenderedPageBreak/>
-        <w:t>1</w:t>
-      </w:r>
-      <w:r>
-        <w:t>8</w:t>
-      </w:r>
-      <w:r>
-        <w:t>.02.2025</w:t>
+        <w:t>18.02.2025</w:t>
       </w:r>
     </w:p>
     <w:p>
@@ -2181,7 +2175,7 @@
     </w:p>
     <w:p>
       <w:r>
-        <w:t>-Mise à jour du planning</w:t>
+        <w:t>Mise à jour du planning et du journal de travail.</w:t>
       </w:r>
     </w:p>
     <w:p>
@@ -2211,18 +2205,317 @@
       </w:pPr>
       <w:r>
         <w:lastRenderedPageBreak/>
-        <w:t>0</w:t>
-      </w:r>
-      <w:r>
-        <w:t>4</w:t>
-      </w:r>
-      <w:r>
-        <w:t>.03.2025</w:t>
-      </w:r>
+        <w:t>04.03.2025</w:t>
+      </w:r>
+    </w:p>
+    <w:p>
+      <w:r>
+        <w:t>Ce qui a été fait :</w:t>
+      </w:r>
+    </w:p>
+    <w:p>
+      <w:r>
+        <w:t xml:space="preserve">J’ai </w:t>
+      </w:r>
+      <w:r>
+        <w:rPr>
+          <w:b/>
+        </w:rPr>
+        <w:t>modifié la gestion de la vélocité</w:t>
+      </w:r>
+      <w:r>
+        <w:t xml:space="preserve"> dans ma classe Player en ajoutant une méthode « </w:t>
+      </w:r>
+      <w:proofErr w:type="spellStart"/>
+      <w:r>
+        <w:t>Brake</w:t>
+      </w:r>
+      <w:proofErr w:type="spellEnd"/>
+      <w:r>
+        <w:t> ». Celle-ci permet à la vitesse du joueur de diminuer progressivement avec un petit délai avec un coefficient de décélération que j’applique au vecteur de vélocité.</w:t>
+      </w:r>
+    </w:p>
+    <w:p>
+      <w:r>
+        <w:t>J’ai aussi supprimé des méthodes inutiles pour déplacer le joueur qui se nommaient :</w:t>
+      </w:r>
+    </w:p>
+    <w:p>
+      <w:proofErr w:type="spellStart"/>
+      <w:r>
+        <w:t>MovePlayerUp</w:t>
+      </w:r>
+      <w:proofErr w:type="spellEnd"/>
+      <w:r>
+        <w:t xml:space="preserve">, </w:t>
+      </w:r>
+      <w:proofErr w:type="spellStart"/>
+      <w:r>
+        <w:t>MovePlayerDown</w:t>
+      </w:r>
+      <w:proofErr w:type="spellEnd"/>
+      <w:r>
+        <w:t>, etc…</w:t>
+      </w:r>
+    </w:p>
+    <w:p>
+      <w:pPr>
+        <w:rPr>
+          <w:noProof/>
+        </w:rPr>
+      </w:pPr>
+      <w:r>
+        <w:rPr>
+          <w:noProof/>
+        </w:rPr>
+        <w:drawing>
+          <wp:anchor distT="0" distB="0" distL="114300" distR="114300" simplePos="0" relativeHeight="251663360" behindDoc="1" locked="0" layoutInCell="1" allowOverlap="1" wp14:anchorId="4647757A" wp14:editId="24B2E75D">
+            <wp:simplePos x="0" y="0"/>
+            <wp:positionH relativeFrom="margin">
+              <wp:align>left</wp:align>
+            </wp:positionH>
+            <wp:positionV relativeFrom="paragraph">
+              <wp:posOffset>2840695</wp:posOffset>
+            </wp:positionV>
+            <wp:extent cx="3232298" cy="1565523"/>
+            <wp:effectExtent l="0" t="0" r="6350" b="0"/>
+            <wp:wrapTopAndBottom/>
+            <wp:docPr id="3" name="Image 3"/>
+            <wp:cNvGraphicFramePr>
+              <a:graphicFrameLocks xmlns:a="http://schemas.openxmlformats.org/drawingml/2006/main" noChangeAspect="1"/>
+            </wp:cNvGraphicFramePr>
+            <a:graphic xmlns:a="http://schemas.openxmlformats.org/drawingml/2006/main">
+              <a:graphicData uri="http://schemas.openxmlformats.org/drawingml/2006/picture">
+                <pic:pic xmlns:pic="http://schemas.openxmlformats.org/drawingml/2006/picture">
+                  <pic:nvPicPr>
+                    <pic:cNvPr id="1" name=""/>
+                    <pic:cNvPicPr/>
+                  </pic:nvPicPr>
+                  <pic:blipFill>
+                    <a:blip r:embed="rId8">
+                      <a:extLst>
+                        <a:ext uri="{28A0092B-C50C-407E-A947-70E740481C1C}">
+                          <a14:useLocalDpi xmlns:a14="http://schemas.microsoft.com/office/drawing/2010/main" val="0"/>
+                        </a:ext>
+                      </a:extLst>
+                    </a:blip>
+                    <a:stretch>
+                      <a:fillRect/>
+                    </a:stretch>
+                  </pic:blipFill>
+                  <pic:spPr>
+                    <a:xfrm>
+                      <a:off x="0" y="0"/>
+                      <a:ext cx="3232298" cy="1565523"/>
+                    </a:xfrm>
+                    <a:prstGeom prst="rect">
+                      <a:avLst/>
+                    </a:prstGeom>
+                  </pic:spPr>
+                </pic:pic>
+              </a:graphicData>
+            </a:graphic>
+            <wp14:sizeRelH relativeFrom="margin">
+              <wp14:pctWidth>0</wp14:pctWidth>
+            </wp14:sizeRelH>
+            <wp14:sizeRelV relativeFrom="margin">
+              <wp14:pctHeight>0</wp14:pctHeight>
+            </wp14:sizeRelV>
+          </wp:anchor>
+        </w:drawing>
+      </w:r>
+      <w:r>
+        <w:rPr>
+          <w:noProof/>
+        </w:rPr>
+        <w:drawing>
+          <wp:anchor distT="0" distB="0" distL="114300" distR="114300" simplePos="0" relativeHeight="251662336" behindDoc="0" locked="0" layoutInCell="1" allowOverlap="1" wp14:anchorId="71557965" wp14:editId="57AA7323">
+            <wp:simplePos x="0" y="0"/>
+            <wp:positionH relativeFrom="margin">
+              <wp:align>left</wp:align>
+            </wp:positionH>
+            <wp:positionV relativeFrom="paragraph">
+              <wp:posOffset>416280</wp:posOffset>
+            </wp:positionV>
+            <wp:extent cx="4710588" cy="2509510"/>
+            <wp:effectExtent l="0" t="0" r="0" b="5715"/>
+            <wp:wrapTopAndBottom/>
+            <wp:docPr id="4" name="Image 4"/>
+            <wp:cNvGraphicFramePr>
+              <a:graphicFrameLocks xmlns:a="http://schemas.openxmlformats.org/drawingml/2006/main" noChangeAspect="1"/>
+            </wp:cNvGraphicFramePr>
+            <a:graphic xmlns:a="http://schemas.openxmlformats.org/drawingml/2006/main">
+              <a:graphicData uri="http://schemas.openxmlformats.org/drawingml/2006/picture">
+                <pic:pic xmlns:pic="http://schemas.openxmlformats.org/drawingml/2006/picture">
+                  <pic:nvPicPr>
+                    <pic:cNvPr id="1" name=""/>
+                    <pic:cNvPicPr/>
+                  </pic:nvPicPr>
+                  <pic:blipFill>
+                    <a:blip r:embed="rId9">
+                      <a:extLst>
+                        <a:ext uri="{28A0092B-C50C-407E-A947-70E740481C1C}">
+                          <a14:useLocalDpi xmlns:a14="http://schemas.microsoft.com/office/drawing/2010/main" val="0"/>
+                        </a:ext>
+                      </a:extLst>
+                    </a:blip>
+                    <a:stretch>
+                      <a:fillRect/>
+                    </a:stretch>
+                  </pic:blipFill>
+                  <pic:spPr>
+                    <a:xfrm>
+                      <a:off x="0" y="0"/>
+                      <a:ext cx="4710588" cy="2509510"/>
+                    </a:xfrm>
+                    <a:prstGeom prst="rect">
+                      <a:avLst/>
+                    </a:prstGeom>
+                  </pic:spPr>
+                </pic:pic>
+              </a:graphicData>
+            </a:graphic>
+            <wp14:sizeRelH relativeFrom="margin">
+              <wp14:pctWidth>0</wp14:pctWidth>
+            </wp14:sizeRelH>
+            <wp14:sizeRelV relativeFrom="margin">
+              <wp14:pctHeight>0</wp14:pctHeight>
+            </wp14:sizeRelV>
+          </wp:anchor>
+        </w:drawing>
+      </w:r>
+      <w:r>
+        <w:t>Puis je les ai remplacées par un seul vecteur 3D que j’ai appelé « </w:t>
+      </w:r>
+      <w:proofErr w:type="spellStart"/>
+      <w:r>
+        <w:t>movement</w:t>
+      </w:r>
+      <w:proofErr w:type="spellEnd"/>
+      <w:r>
+        <w:t> » qui était modifié selon la touche pressée.</w:t>
+      </w:r>
+    </w:p>
+    <w:p>
+      <w:pPr>
+        <w:spacing w:before="360"/>
+      </w:pPr>
+      <w:r>
+        <w:t xml:space="preserve">J’ai aussi commencé à </w:t>
+      </w:r>
+      <w:r>
+        <w:rPr>
+          <w:b/>
+        </w:rPr>
+        <w:t>ajouter d’autres obstacles</w:t>
+      </w:r>
+      <w:r>
+        <w:t>. Je m’attendais à ce que tous les obstacles dans ma liste d’obstacles agissent de la même manière. Lorsqu’ils passaient par mon gestionnaire de collision dans « Player », donc un « </w:t>
+      </w:r>
+      <w:proofErr w:type="spellStart"/>
+      <w:r>
+        <w:t>foreach</w:t>
+      </w:r>
+      <w:proofErr w:type="spellEnd"/>
+      <w:r>
+        <w:t xml:space="preserve"> » pour tester toutes les collisions en même temps, il était impossible pour le joueur de se trouver au sommet de celui-ci en mode orthographique. Également, les collisions ne fonctionnaient pas correctement. Je n’ai malheureusement pas trouvé la solution tout de suite. </w:t>
+      </w:r>
+    </w:p>
+    <w:p>
+      <w:r>
+        <w:t>Mise à jour du planning et du journal de travail.</w:t>
+      </w:r>
+    </w:p>
+    <w:p>
+      <w:pPr>
+        <w:rPr>
+          <w:noProof/>
+        </w:rPr>
+      </w:pPr>
+      <w:r>
+        <w:rPr>
+          <w:noProof/>
+        </w:rPr>
+        <w:br w:type="page"/>
+      </w:r>
+    </w:p>
+    <w:p>
+      <w:pPr>
+        <w:pStyle w:val="Titre1"/>
+        <w:numPr>
+          <w:ilvl w:val="0"/>
+          <w:numId w:val="1"/>
+        </w:numPr>
+        <w:rPr>
+          <w:noProof/>
+        </w:rPr>
+      </w:pPr>
+      <w:r>
+        <w:rPr>
+          <w:noProof/>
+        </w:rPr>
+        <w:lastRenderedPageBreak/>
+        <w:t>10.03.2025</w:t>
+      </w:r>
+    </w:p>
+    <w:p>
+      <w:r>
+        <w:br w:type="page"/>
+      </w:r>
+    </w:p>
+    <w:p>
+      <w:pPr>
+        <w:pStyle w:val="Titre1"/>
+        <w:numPr>
+          <w:ilvl w:val="0"/>
+          <w:numId w:val="1"/>
+        </w:numPr>
+      </w:pPr>
+      <w:r>
+        <w:lastRenderedPageBreak/>
+        <w:t>11.03.2025</w:t>
+      </w:r>
+    </w:p>
+    <w:p>
+      <w:r>
+        <w:br w:type="page"/>
+      </w:r>
+    </w:p>
+    <w:p>
+      <w:pPr>
+        <w:pStyle w:val="Titre1"/>
+        <w:numPr>
+          <w:ilvl w:val="0"/>
+          <w:numId w:val="1"/>
+        </w:numPr>
+      </w:pPr>
+      <w:r>
+        <w:lastRenderedPageBreak/>
+        <w:t>17.03.2025</w:t>
+      </w:r>
+    </w:p>
+    <w:p>
+      <w:r>
+        <w:br w:type="page"/>
+      </w:r>
+    </w:p>
+    <w:p>
+      <w:pPr>
+        <w:pStyle w:val="Titre1"/>
+        <w:numPr>
+          <w:ilvl w:val="0"/>
+          <w:numId w:val="1"/>
+        </w:numPr>
+      </w:pPr>
+      <w:r>
+        <w:lastRenderedPageBreak/>
+        <w:t>18.03.2025</w:t>
+      </w:r>
+    </w:p>
+    <w:p>
       <w:bookmarkStart w:id="8" w:name="_GoBack"/>
       <w:bookmarkEnd w:id="8"/>
     </w:p>
-    <w:p/>
     <w:sectPr>
       <w:pgSz w:w="11906" w:h="16838"/>
       <w:pgMar w:top="1417" w:right="1417" w:bottom="1417" w:left="1417" w:header="708" w:footer="708" w:gutter="0"/>
@@ -2470,7 +2763,7 @@
   <w:abstractNum w:abstractNumId="2" w15:restartNumberingAfterBreak="0">
     <w:nsid w:val="0E8414DF"/>
     <w:multiLevelType w:val="hybridMultilevel"/>
-    <w:tmpl w:val="A9C0C180"/>
+    <w:tmpl w:val="ABEE4082"/>
     <w:lvl w:ilvl="0" w:tplc="100C000F">
       <w:start w:val="1"/>
       <w:numFmt w:val="decimal"/>
@@ -3092,6 +3385,119 @@
     </w:lvl>
   </w:abstractNum>
   <w:abstractNum w:abstractNumId="8" w15:restartNumberingAfterBreak="0">
+    <w:nsid w:val="350C570A"/>
+    <w:multiLevelType w:val="hybridMultilevel"/>
+    <w:tmpl w:val="C3CC1F20"/>
+    <w:lvl w:ilvl="0" w:tplc="100C0001">
+      <w:start w:val="1"/>
+      <w:numFmt w:val="bullet"/>
+      <w:lvlText w:val=""/>
+      <w:lvlJc w:val="left"/>
+      <w:pPr>
+        <w:ind w:left="720" w:hanging="360"/>
+      </w:pPr>
+      <w:rPr>
+        <w:rFonts w:ascii="Symbol" w:hAnsi="Symbol" w:hint="default"/>
+      </w:rPr>
+    </w:lvl>
+    <w:lvl w:ilvl="1" w:tplc="100C0003" w:tentative="1">
+      <w:start w:val="1"/>
+      <w:numFmt w:val="bullet"/>
+      <w:lvlText w:val="o"/>
+      <w:lvlJc w:val="left"/>
+      <w:pPr>
+        <w:ind w:left="1440" w:hanging="360"/>
+      </w:pPr>
+      <w:rPr>
+        <w:rFonts w:ascii="Courier New" w:hAnsi="Courier New" w:cs="Courier New" w:hint="default"/>
+      </w:rPr>
+    </w:lvl>
+    <w:lvl w:ilvl="2" w:tplc="100C0005" w:tentative="1">
+      <w:start w:val="1"/>
+      <w:numFmt w:val="bullet"/>
+      <w:lvlText w:val=""/>
+      <w:lvlJc w:val="left"/>
+      <w:pPr>
+        <w:ind w:left="2160" w:hanging="360"/>
+      </w:pPr>
+      <w:rPr>
+        <w:rFonts w:ascii="Wingdings" w:hAnsi="Wingdings" w:hint="default"/>
+      </w:rPr>
+    </w:lvl>
+    <w:lvl w:ilvl="3" w:tplc="100C0001" w:tentative="1">
+      <w:start w:val="1"/>
+      <w:numFmt w:val="bullet"/>
+      <w:lvlText w:val=""/>
+      <w:lvlJc w:val="left"/>
+      <w:pPr>
+        <w:ind w:left="2880" w:hanging="360"/>
+      </w:pPr>
+      <w:rPr>
+        <w:rFonts w:ascii="Symbol" w:hAnsi="Symbol" w:hint="default"/>
+      </w:rPr>
+    </w:lvl>
+    <w:lvl w:ilvl="4" w:tplc="100C0003" w:tentative="1">
+      <w:start w:val="1"/>
+      <w:numFmt w:val="bullet"/>
+      <w:lvlText w:val="o"/>
+      <w:lvlJc w:val="left"/>
+      <w:pPr>
+        <w:ind w:left="3600" w:hanging="360"/>
+      </w:pPr>
+      <w:rPr>
+        <w:rFonts w:ascii="Courier New" w:hAnsi="Courier New" w:cs="Courier New" w:hint="default"/>
+      </w:rPr>
+    </w:lvl>
+    <w:lvl w:ilvl="5" w:tplc="100C0005" w:tentative="1">
+      <w:start w:val="1"/>
+      <w:numFmt w:val="bullet"/>
+      <w:lvlText w:val=""/>
+      <w:lvlJc w:val="left"/>
+      <w:pPr>
+        <w:ind w:left="4320" w:hanging="360"/>
+      </w:pPr>
+      <w:rPr>
+        <w:rFonts w:ascii="Wingdings" w:hAnsi="Wingdings" w:hint="default"/>
+      </w:rPr>
+    </w:lvl>
+    <w:lvl w:ilvl="6" w:tplc="100C0001" w:tentative="1">
+      <w:start w:val="1"/>
+      <w:numFmt w:val="bullet"/>
+      <w:lvlText w:val=""/>
+      <w:lvlJc w:val="left"/>
+      <w:pPr>
+        <w:ind w:left="5040" w:hanging="360"/>
+      </w:pPr>
+      <w:rPr>
+        <w:rFonts w:ascii="Symbol" w:hAnsi="Symbol" w:hint="default"/>
+      </w:rPr>
+    </w:lvl>
+    <w:lvl w:ilvl="7" w:tplc="100C0003" w:tentative="1">
+      <w:start w:val="1"/>
+      <w:numFmt w:val="bullet"/>
+      <w:lvlText w:val="o"/>
+      <w:lvlJc w:val="left"/>
+      <w:pPr>
+        <w:ind w:left="5760" w:hanging="360"/>
+      </w:pPr>
+      <w:rPr>
+        <w:rFonts w:ascii="Courier New" w:hAnsi="Courier New" w:cs="Courier New" w:hint="default"/>
+      </w:rPr>
+    </w:lvl>
+    <w:lvl w:ilvl="8" w:tplc="100C0005" w:tentative="1">
+      <w:start w:val="1"/>
+      <w:numFmt w:val="bullet"/>
+      <w:lvlText w:val=""/>
+      <w:lvlJc w:val="left"/>
+      <w:pPr>
+        <w:ind w:left="6480" w:hanging="360"/>
+      </w:pPr>
+      <w:rPr>
+        <w:rFonts w:ascii="Wingdings" w:hAnsi="Wingdings" w:hint="default"/>
+      </w:rPr>
+    </w:lvl>
+  </w:abstractNum>
+  <w:abstractNum w:abstractNumId="9" w15:restartNumberingAfterBreak="0">
     <w:nsid w:val="3BE62C46"/>
     <w:multiLevelType w:val="hybridMultilevel"/>
     <w:tmpl w:val="7E68C346"/>
@@ -3204,7 +3610,7 @@
       </w:rPr>
     </w:lvl>
   </w:abstractNum>
-  <w:abstractNum w:abstractNumId="9" w15:restartNumberingAfterBreak="0">
+  <w:abstractNum w:abstractNumId="10" w15:restartNumberingAfterBreak="0">
     <w:nsid w:val="49AE59B2"/>
     <w:multiLevelType w:val="hybridMultilevel"/>
     <w:tmpl w:val="8BFCC104"/>
@@ -3290,7 +3696,7 @@
       </w:pPr>
     </w:lvl>
   </w:abstractNum>
-  <w:abstractNum w:abstractNumId="10" w15:restartNumberingAfterBreak="0">
+  <w:abstractNum w:abstractNumId="11" w15:restartNumberingAfterBreak="0">
     <w:nsid w:val="4EB24BBC"/>
     <w:multiLevelType w:val="hybridMultilevel"/>
     <w:tmpl w:val="8338616C"/>
@@ -3376,7 +3782,7 @@
       </w:pPr>
     </w:lvl>
   </w:abstractNum>
-  <w:abstractNum w:abstractNumId="11" w15:restartNumberingAfterBreak="0">
+  <w:abstractNum w:abstractNumId="12" w15:restartNumberingAfterBreak="0">
     <w:nsid w:val="5FC01693"/>
     <w:multiLevelType w:val="hybridMultilevel"/>
     <w:tmpl w:val="622A71DC"/>
@@ -3489,7 +3895,7 @@
       </w:rPr>
     </w:lvl>
   </w:abstractNum>
-  <w:abstractNum w:abstractNumId="12" w15:restartNumberingAfterBreak="0">
+  <w:abstractNum w:abstractNumId="13" w15:restartNumberingAfterBreak="0">
     <w:nsid w:val="61F1310A"/>
     <w:multiLevelType w:val="hybridMultilevel"/>
     <w:tmpl w:val="133EB1BE"/>
@@ -3602,7 +4008,7 @@
       </w:rPr>
     </w:lvl>
   </w:abstractNum>
-  <w:abstractNum w:abstractNumId="13" w15:restartNumberingAfterBreak="0">
+  <w:abstractNum w:abstractNumId="14" w15:restartNumberingAfterBreak="0">
     <w:nsid w:val="6FBF3430"/>
     <w:multiLevelType w:val="hybridMultilevel"/>
     <w:tmpl w:val="B900E876"/>
@@ -3715,7 +4121,7 @@
       </w:rPr>
     </w:lvl>
   </w:abstractNum>
-  <w:abstractNum w:abstractNumId="14" w15:restartNumberingAfterBreak="0">
+  <w:abstractNum w:abstractNumId="15" w15:restartNumberingAfterBreak="0">
     <w:nsid w:val="71226459"/>
     <w:multiLevelType w:val="hybridMultilevel"/>
     <w:tmpl w:val="CD90C7B6"/>
@@ -3805,10 +4211,10 @@
     <w:abstractNumId w:val="2"/>
   </w:num>
   <w:num w:numId="2">
-    <w:abstractNumId w:val="12"/>
+    <w:abstractNumId w:val="13"/>
   </w:num>
   <w:num w:numId="3">
-    <w:abstractNumId w:val="11"/>
+    <w:abstractNumId w:val="12"/>
   </w:num>
   <w:num w:numId="4">
     <w:abstractNumId w:val="5"/>
@@ -3817,10 +4223,10 @@
     <w:abstractNumId w:val="4"/>
   </w:num>
   <w:num w:numId="6">
-    <w:abstractNumId w:val="13"/>
+    <w:abstractNumId w:val="14"/>
   </w:num>
   <w:num w:numId="7">
-    <w:abstractNumId w:val="8"/>
+    <w:abstractNumId w:val="9"/>
   </w:num>
   <w:num w:numId="8">
     <w:abstractNumId w:val="6"/>
@@ -3832,19 +4238,22 @@
     <w:abstractNumId w:val="1"/>
   </w:num>
   <w:num w:numId="11">
-    <w:abstractNumId w:val="14"/>
+    <w:abstractNumId w:val="15"/>
   </w:num>
   <w:num w:numId="12">
     <w:abstractNumId w:val="7"/>
   </w:num>
   <w:num w:numId="13">
-    <w:abstractNumId w:val="10"/>
+    <w:abstractNumId w:val="11"/>
   </w:num>
   <w:num w:numId="14">
-    <w:abstractNumId w:val="9"/>
+    <w:abstractNumId w:val="10"/>
   </w:num>
   <w:num w:numId="15">
     <w:abstractNumId w:val="3"/>
+  </w:num>
+  <w:num w:numId="16">
+    <w:abstractNumId w:val="8"/>
   </w:num>
 </w:numbering>
 </file>
@@ -4741,7 +5150,7 @@
 </file>
 
 <file path=customXml/itemProps1.xml><?xml version="1.0" encoding="utf-8"?>
-<ds:datastoreItem xmlns:ds="http://schemas.openxmlformats.org/officeDocument/2006/customXml" ds:itemID="{8DABAD3A-41C4-4863-BA94-350012FFA1EA}">
+<ds:datastoreItem xmlns:ds="http://schemas.openxmlformats.org/officeDocument/2006/customXml" ds:itemID="{5C2237A2-0179-4906-B614-ACF93A6B5002}">
   <ds:schemaRefs>
     <ds:schemaRef ds:uri="http://schemas.openxmlformats.org/officeDocument/2006/bibliography"/>
   </ds:schemaRefs>

</xml_diff>